<commit_message>
updated the cover letter
</commit_message>
<xml_diff>
--- a/Cover_Letter.docx
+++ b/Cover_Letter.docx
@@ -167,31 +167,37 @@
         <w:rPr>
           <w:rFonts w:ascii="Times New Roman" w:hAnsi="Times New Roman" w:cs="Times New Roman"/>
         </w:rPr>
-        <w:t>We believe this work is well suited to Biomedical Optics Express because it characterises a systematic imaging artefact and shows that the underestimation can be corrected by calibration. The findings are relevant to researchers using vessel diameter or vessel density as outcome measures in studies of retinal vascular function and disease.</w:t>
-      </w:r>
-      <w:proofErr w:type="spellStart"/>
-      <w:r>
-        <w:rPr>
-          <w:rFonts w:ascii="Times New Roman" w:hAnsi="Times New Roman" w:cs="Times New Roman"/>
-        </w:rPr>
-      </w:r>
-      <w:proofErr w:type="spellEnd"/>
-      <w:r>
-        <w:rPr>
-          <w:rFonts w:ascii="Times New Roman" w:hAnsi="Times New Roman" w:cs="Times New Roman"/>
-        </w:rPr>
-      </w:r>
-      <w:proofErr w:type="spellStart"/>
-      <w:r>
-        <w:rPr>
-          <w:rFonts w:ascii="Times New Roman" w:hAnsi="Times New Roman" w:cs="Times New Roman"/>
-        </w:rPr>
-      </w:r>
-      <w:proofErr w:type="spellEnd"/>
-      <w:r>
-        <w:rPr>
-          <w:rFonts w:ascii="Times New Roman" w:hAnsi="Times New Roman" w:cs="Times New Roman"/>
-        </w:rPr>
+        <w:t xml:space="preserve">We believe this work is well suited to Biomedical Optics Express because it characterises a systematic imaging artefact and shows that the underestimation can be corrected by calibration. The findings are relevant to researchers using vessel diameter or vessel density as </w:t>
+      </w:r>
+      <w:r>
+        <w:rPr>
+          <w:rFonts w:ascii="Times New Roman" w:hAnsi="Times New Roman" w:cs="Times New Roman"/>
+        </w:rPr>
+        <w:t xml:space="preserve">biomarkers </w:t>
+      </w:r>
+      <w:r>
+        <w:rPr>
+          <w:rFonts w:ascii="Times New Roman" w:hAnsi="Times New Roman" w:cs="Times New Roman"/>
+        </w:rPr>
+        <w:t>in retinal disease</w:t>
+      </w:r>
+      <w:r>
+        <w:rPr>
+          <w:rFonts w:ascii="Times New Roman" w:hAnsi="Times New Roman" w:cs="Times New Roman"/>
+        </w:rPr>
+        <w:t xml:space="preserve"> </w:t>
+      </w:r>
+      <w:r>
+        <w:rPr>
+          <w:rFonts w:ascii="Times New Roman" w:hAnsi="Times New Roman" w:cs="Times New Roman"/>
+        </w:rPr>
+        <w:t>studies</w:t>
+      </w:r>
+      <w:r>
+        <w:rPr>
+          <w:rFonts w:ascii="Times New Roman" w:hAnsi="Times New Roman" w:cs="Times New Roman"/>
+        </w:rPr>
+        <w:t>.</w:t>
       </w:r>
     </w:p>
     <w:p>
@@ -205,6 +211,67 @@
           <w:rFonts w:ascii="Times New Roman" w:hAnsi="Times New Roman" w:cs="Times New Roman"/>
         </w:rPr>
         <w:t>We confirm that this manuscript has not been previously published and is not currently under consideration by another journal. All authors have read and approved the submitted version, and we have no conflicts of interest to disclose.</w:t>
+      </w:r>
+    </w:p>
+    <w:p>
+      <w:pPr>
+        <w:rPr>
+          <w:rFonts w:ascii="Times New Roman" w:hAnsi="Times New Roman" w:cs="Times New Roman"/>
+        </w:rPr>
+      </w:pPr>
+      <w:r>
+        <w:rPr>
+          <w:rFonts w:ascii="Times New Roman" w:hAnsi="Times New Roman" w:cs="Times New Roman"/>
+        </w:rPr>
+        <w:t>We suggest the following reviewers for this manuscript:</w:t>
+      </w:r>
+      <w:r>
+        <w:rPr>
+          <w:rFonts w:ascii="Times New Roman" w:hAnsi="Times New Roman" w:cs="Times New Roman"/>
+        </w:rPr>
+        <w:br/>
+      </w:r>
+      <w:r>
+        <w:rPr>
+          <w:rFonts w:ascii="Times New Roman" w:hAnsi="Times New Roman" w:cs="Times New Roman"/>
+        </w:rPr>
+        <w:t>Ravi Jonnal, University of California, Davis, USA (rjonnal@gmail.com)</w:t>
+      </w:r>
+      <w:r>
+        <w:rPr>
+          <w:rFonts w:ascii="Times New Roman" w:hAnsi="Times New Roman" w:cs="Times New Roman"/>
+        </w:rPr>
+        <w:br/>
+      </w:r>
+      <w:r>
+        <w:rPr>
+          <w:rFonts w:ascii="Times New Roman" w:hAnsi="Times New Roman" w:cs="Times New Roman"/>
+        </w:rPr>
+        <w:t>Khushmeet Dhaliwal, University of Waterloo, Canada (k8dhaliw@uwaterloo.ca)</w:t>
+      </w:r>
+      <w:r>
+        <w:rPr>
+          <w:rFonts w:ascii="Times New Roman" w:hAnsi="Times New Roman" w:cs="Times New Roman"/>
+        </w:rPr>
+        <w:br/>
+      </w:r>
+      <w:r>
+        <w:rPr>
+          <w:rFonts w:ascii="Times New Roman" w:hAnsi="Times New Roman" w:cs="Times New Roman"/>
+        </w:rPr>
+        <w:t>Alessandro Invernizzi, University of Milan, Italy (alessandro.invernizzi@unimi.it)</w:t>
+      </w:r>
+      <w:r>
+        <w:rPr>
+          <w:rFonts w:ascii="Times New Roman" w:hAnsi="Times New Roman" w:cs="Times New Roman"/>
+        </w:rPr>
+        <w:br/>
+      </w:r>
+      <w:r>
+        <w:rPr>
+          <w:rFonts w:ascii="Times New Roman" w:hAnsi="Times New Roman" w:cs="Times New Roman"/>
+        </w:rPr>
+        <w:t>Yuki Muraoka, Kyoto University, Japan (muraoka@kuhp.kyoto-u.ac.jp)</w:t>
       </w:r>
     </w:p>
     <w:p>

</xml_diff>